<commit_message>
Project Plan : add College OS project plan source of truth documentation in docx, html, and pdf formats
</commit_message>
<xml_diff>
--- a/Project Plan/College_OS_Project_Plan_Source_of_Truth.docx
+++ b/Project Plan/College_OS_Project_Plan_Source_of_Truth.docx
@@ -6703,12 +6703,7 @@
         <w:spacing w:before="80" w:after="80"/>
       </w:pPr>
       <w:r>
-        <w:rPr>
-          <w:color w:val="1E293B"/>
-          <w:sz w:val="20"/>
-          <w:rFonts w:ascii="Segoe UI" w:hAnsi="Segoe UI"/>
-        </w:rPr>
-        <w:t xml:space="preserve">The Campus AI Assistant is NOT an unrestricted general-purpose chatbot. Its primary purpose is college-specific information assistance:</w:t>
+        <w:t>The Campus AI Assistant is NOT an unrestricted general-purpose chatbot. Its primary purpose is college-specific information assistance:</w:t>
       </w:r>
     </w:p>
     <w:p>
@@ -6717,30 +6712,7 @@
         <w:ind w:left="400" w:hanging="240"/>
       </w:pPr>
       <w:r>
-        <w:rPr>
-          <w:b/>
-          <w:sz w:val="20"/>
-          <w:color w:val="2563EB"/>
-          <w:rFonts w:ascii="Segoe UI" w:hAnsi="Segoe UI"/>
-        </w:rPr>
-        <w:t xml:space="preserve">•  </w:t>
-      </w:r>
-      <w:r>
-        <w:rPr>
-          <w:b/>
-          <w:sz w:val="20"/>
-          <w:color w:val="0F172A"/>
-          <w:rFonts w:ascii="Segoe UI" w:hAnsi="Segoe UI"/>
-        </w:rPr>
-        <w:t xml:space="preserve">Primary Source of Truth: </w:t>
-      </w:r>
-      <w:r>
-        <w:rPr>
-          <w:sz w:val="20"/>
-          <w:color w:val="334155"/>
-          <w:rFonts w:ascii="Segoe UI" w:hAnsi="Segoe UI"/>
-        </w:rPr>
-        <w:t xml:space="preserve">The AI prioritizes authenticated data within College OS databases.</w:t>
+        <w:t>•  College OS is the Primary Source of Truth: The assistant's reasoning is anchored strictly in authoritative College OS databases (MongoDB operational store) and verified institutional documents (RAG vector store).</w:t>
       </w:r>
     </w:p>
     <w:p>
@@ -6749,30 +6721,7 @@
         <w:ind w:left="400" w:hanging="240"/>
       </w:pPr>
       <w:r>
-        <w:rPr>
-          <w:b/>
-          <w:sz w:val="20"/>
-          <w:color w:val="2563EB"/>
-          <w:rFonts w:ascii="Segoe UI" w:hAnsi="Segoe UI"/>
-        </w:rPr>
-        <w:t xml:space="preserve">•  </w:t>
-      </w:r>
-      <w:r>
-        <w:rPr>
-          <w:b/>
-          <w:sz w:val="20"/>
-          <w:color w:val="0F172A"/>
-          <w:rFonts w:ascii="Segoe UI" w:hAnsi="Segoe UI"/>
-        </w:rPr>
-        <w:t xml:space="preserve">Zero Hallucination Mandate: </w:t>
-      </w:r>
-      <w:r>
-        <w:rPr>
-          <w:sz w:val="20"/>
-          <w:color w:val="334155"/>
-          <w:rFonts w:ascii="Segoe UI" w:hAnsi="Segoe UI"/>
-        </w:rPr>
-        <w:t xml:space="preserve">If required information is unavailable, the AI explicitly states 'Information unavailable'—it will NEVER hallucinate speculative answers.</w:t>
+        <w:t>•  One Common Engine with Role-Aware Context: Student AI and Faculty AI share ONE common Campus AI engine. The authenticated user's role and RBAC permissions govern accessible context, permitted data, RAG document scope, suggested prompts, and actions.</w:t>
       </w:r>
     </w:p>
     <w:p>
@@ -6781,30 +6730,7 @@
         <w:ind w:left="400" w:hanging="240"/>
       </w:pPr>
       <w:r>
-        <w:rPr>
-          <w:b/>
-          <w:sz w:val="20"/>
-          <w:color w:val="2563EB"/>
-          <w:rFonts w:ascii="Segoe UI" w:hAnsi="Segoe UI"/>
-        </w:rPr>
-        <w:t xml:space="preserve">•  </w:t>
-      </w:r>
-      <w:r>
-        <w:rPr>
-          <w:b/>
-          <w:sz w:val="20"/>
-          <w:color w:val="0F172A"/>
-          <w:rFonts w:ascii="Segoe UI" w:hAnsi="Segoe UI"/>
-        </w:rPr>
-        <w:t xml:space="preserve">Role-Based Data Privacy: </w:t>
-      </w:r>
-      <w:r>
-        <w:rPr>
-          <w:sz w:val="20"/>
-          <w:color w:val="334155"/>
-          <w:rFonts w:ascii="Segoe UI" w:hAnsi="Segoe UI"/>
-        </w:rPr>
-        <w:t xml:space="preserve">The AI strictly enforces user role boundaries. A student cannot query another student's marks or private data.</w:t>
+        <w:t>•  Absolute Anti-Hallucination Mandate: If an authenticated student or faculty member asks a college question not found in verified records, the assistant explicitly responds: 'This information is currently unavailable in official college records', rather than speculating.</w:t>
       </w:r>
     </w:p>
     <w:p>
@@ -6813,30 +6739,7 @@
         <w:ind w:left="400" w:hanging="240"/>
       </w:pPr>
       <w:r>
-        <w:rPr>
-          <w:b/>
-          <w:sz w:val="20"/>
-          <w:color w:val="2563EB"/>
-          <w:rFonts w:ascii="Segoe UI" w:hAnsi="Segoe UI"/>
-        </w:rPr>
-        <w:t xml:space="preserve">•  </w:t>
-      </w:r>
-      <w:r>
-        <w:rPr>
-          <w:b/>
-          <w:sz w:val="20"/>
-          <w:color w:val="0F172A"/>
-          <w:rFonts w:ascii="Segoe UI" w:hAnsi="Segoe UI"/>
-        </w:rPr>
-        <w:t xml:space="preserve">Security Credentials Barred: </w:t>
-      </w:r>
-      <w:r>
-        <w:rPr>
-          <w:sz w:val="20"/>
-          <w:color w:val="334155"/>
-          <w:rFonts w:ascii="Segoe UI" w:hAnsi="Segoe UI"/>
-        </w:rPr>
-        <w:t xml:space="preserve">Passwords, OTPs, session tokens, and security secrets are cryptographically barred from ever entering AI prompt contexts.</w:t>
+        <w:t>•  Contextual Privacy, Least-Privilege &amp; Credential Exclusion: Queries strictly enforce RBAC (students: own records; faculty: assigned classes/students). The AI never exposes unauthorized peer data, another faculty's records, or credentials.</w:t>
       </w:r>
     </w:p>
     <w:p>
@@ -13603,6 +13506,92 @@
         <w:br w:type="page"/>
       </w:r>
     </w:p>
+    <w:p>
+      <w:r>
+        <w:t>A.2 Role-Aware Context, Authorization &amp; Faculty-Specific AI Experience</w:t>
+      </w:r>
+    </w:p>
+    <w:p>
+      <w:r>
+        <w:t>Campus AI is engineered around an essential architectural foundation: Student AI and Faculty AI are NOT two separate AI engines. There is ONE common Campus AI engine powering the entire institution. The authenticated user's role and RBAC permissions dynamically determine accessible context, data retrieval, suggested prompts, and actionable capabilities.</w:t>
+      </w:r>
+    </w:p>
+    <w:p>
+      <w:r>
+        <w:t>Common Campus AI Engine Architecture • Conceptual Pipeline:</w:t>
+      </w:r>
+    </w:p>
+    <w:p>
+      <w:r>
+        <w:t>Campus AI Engine -&gt; Authentication (JWT Session Validation) -&gt; RBAC / Permission Check (Role &amp; Dynamic Assignment Scoping) -&gt; Role-Specific Context (Student Context: Personal Scoped | Faculty Context: Assigned Scoped) -&gt; Query Router (MongoDB | RAG Vector Search | MongoDB + RAG Combined) -&gt; Grounded AI Response (Least Privilege • Zero Hallucination)</w:t>
+      </w:r>
+    </w:p>
+    <w:p>
+      <w:r>
+        <w:t>1. Student AI Context (Personal Scope):</w:t>
+      </w:r>
+    </w:p>
+    <w:p>
+      <w:r>
+        <w:t>Students interact with Campus AI for information they are authorized to access, such as: their attendance records, timetable, assignments and submissions, academic information and marks, relevant campus notices and events, college policies and academic guidelines, and other permitted college/directory information.</w:t>
+      </w:r>
+    </w:p>
+    <w:p>
+      <w:r>
+        <w:t>2. Faculty AI Context (Assigned Scope):</w:t>
+      </w:r>
+    </w:p>
+    <w:p>
+      <w:r>
+        <w:t>Faculty interact with the same Campus AI using a faculty-specific authorized context, including: assigned classes and assigned subjects, assigned students in those classes/subjects, attendance of assigned classes and students, assignments and submissions for assigned classes, marks and assessment results they are authorized to access, faculty timetable, relevant notices and announcements, teaching resources/documents available to them, relevant college policies/guidelines, and faculty-related tasks and academic workflows.</w:t>
+      </w:r>
+    </w:p>
+    <w:p>
+      <w:r>
+        <w:t>3. Strict RBAC &amp; Least-Privilege Guardrails:</w:t>
+      </w:r>
+    </w:p>
+    <w:p>
+      <w:r>
+        <w:t>Every AI query must respect RBAC and least-privilege access. The AI must NEVER expose: unauthorized student data, other faculty's restricted data, private administrative information, passwords, credentials, or other private information.</w:t>
+      </w:r>
+    </w:p>
+    <w:p>
+      <w:r>
+        <w:t>• Example (Student): 'Show my attendance.' -&gt; Retrieves only that student's authorized attendance data.</w:t>
+      </w:r>
+    </w:p>
+    <w:p>
+      <w:r>
+        <w:t>• Example (Faculty): 'Show students below 75% attendance in my assigned CSE-302 class.' -&gt; Retrieves only authorized attendance data for classes/students assigned to that faculty.</w:t>
+      </w:r>
+    </w:p>
+    <w:p>
+      <w:r>
+        <w:t>• Unauthorized Request: 'Show me private records of another faculty member.' -&gt; Denied; returns an appropriate unavailable-or-unauthorized response.</w:t>
+      </w:r>
+    </w:p>
+    <w:p>
+      <w:r>
+        <w:t>4. Data Grounding &amp; RAG Architecture:</w:t>
+      </w:r>
+    </w:p>
+    <w:p>
+      <w:r>
+        <w:t>MongoDB Atlas remains the application source of truth for structured operational data. RAG/vector retrieval remains dedicated to policies, guidelines, circulars, and handbooks. Hybrid queries execute MongoDB + RAG with authorization applied before returning retrieved information. Zero hallucination: unavailable records return an explicit 'Information unavailable' response.</w:t>
+      </w:r>
+    </w:p>
+    <w:p>
+      <w:r>
+        <w:t>5. UI &amp; Route Presentation:</w:t>
+      </w:r>
+    </w:p>
+    <w:p>
+      <w:r>
+        <w:t>The common Campus AI engine presents a role-tailored experience: Student Dashboard assistant for students, and a role-tailored interface (e.g., /faculty/ai or faculty dashboard assistant) with faculty-specific prompts and action scopes.</w:t>
+      </w:r>
+    </w:p>
+    <w:p/>
     <w:p>
       <w:pPr>
         <w:spacing w:before="360" w:after="160"/>

</xml_diff>

<commit_message>
docs: add project plan, source of truth documentation, roadmap, and UI mockups
</commit_message>
<xml_diff>
--- a/Project Plan/College_OS_Project_Plan_Source_of_Truth.docx
+++ b/Project Plan/College_OS_Project_Plan_Source_of_Truth.docx
@@ -501,16 +501,8 @@
             </w:tcMar>
           </w:tcPr>
           <w:p>
-            <w:pPr>
-              <w:spacing w:before="0" w:after="0"/>
-            </w:pPr>
-            <w:r>
-              <w:rPr>
-                <w:sz w:val="17"/>
-                <w:color w:val="334155"/>
-                <w:rFonts w:ascii="Segoe UI" w:hAnsi="Segoe UI"/>
-              </w:rPr>
-              <w:t>Version 1.0 • Step 1 Foundation Locked (Source of Truth)</w:t>
+            <w:r>
+              <w:t>Version 1.1 • Foundation Updated — Auth &amp; Onboarding Locked (Source of Truth)</w:t>
             </w:r>
           </w:p>
         </w:tc>
@@ -575,6 +567,29 @@
           <w:rFonts w:ascii="Segoe UI" w:hAnsi="Segoe UI"/>
         </w:rPr>
         <w:t>Purpose &amp; Authority: This document establishes the authoritative, finalized planning decisions for College OS. All decisions marked as LOCKED are permanently binding across all development phases, backend architectures, MongoDB schemas, Next.js frontend modules, and Campus AI retrieval pipelines.</w:t>
+      </w:r>
+    </w:p>
+    <w:p>
+      <w:r>
+        <w:t>Version 1.1 Revision Changelog (Foundation Updated — Authentication &amp; Institutional Onboarding Locked):</w:t>
+        <w:br/>
+        <w:t>• Added institution-controlled identity architecture ("Users do not choose their institutional role; the institution provisions/authorizes it").</w:t>
+        <w:br/>
+        <w:t>• Replaced unrestricted role-based signup concept; eliminated public self-registration across all roles.</w:t>
+        <w:br/>
+        <w:t>• Locked student account activation workflow via verified institutional records (Enrollment Number + Official Contact + OTP).</w:t>
+        <w:br/>
+        <w:t>• Locked faculty/staff activation workflow (Employee ID + Official Contact + OTP).</w:t>
+        <w:br/>
+        <w:t>• Clarified HOD / Principal / VP provisioning (institution-provisioned; authenticated via Staff/Institutional Login; zero self-elevation).</w:t>
+        <w:br/>
+        <w:t>• Added account lifecycle states: INVITED / NOT_ACTIVATED, ACTIVE, SUSPENDED, GRADUATED / INACTIVE.</w:t>
+        <w:br/>
+        <w:t>• Clarified strict separation of institution-controlled academic identity data vs. user-controlled showcase profile data.</w:t>
+        <w:br/>
+        <w:t>• Updated authentication UI model: two clean entry paths (Student Portal vs. Faculty &amp; College Staff Portal).</w:t>
+        <w:br/>
+        <w:t>• Updated MongoDB operational schemas (users, studentProfiles, facultyProfiles), RBAC matrices, and Campus AI authority pipelines.</w:t>
       </w:r>
     </w:p>
     <w:p>
@@ -2526,13 +2541,7 @@
         <w:spacing w:before="80" w:after="80"/>
       </w:pPr>
       <w:r>
-        <w:rPr>
-          <w:i/>
-          <w:color w:val="64748B"/>
-          <w:sz w:val="18"/>
-          <w:rFonts w:ascii="Segoe UI" w:hAnsi="Segoe UI"/>
-        </w:rPr>
-        <w:t xml:space="preserve">Source of Truth — Version 1.0 • Baseline Architectural Planning</w:t>
+        <w:t>Source of Truth — Version 1.1 — Authentication &amp; Institutional Onboarding Locked • Baseline Architectural Planning</w:t>
       </w:r>
     </w:p>
     <w:p>
@@ -4415,22 +4424,7 @@
         <w:spacing w:before="240" w:after="100"/>
       </w:pPr>
       <w:r>
-        <w:rPr>
-          <w:b/>
-          <w:sz w:val="24"/>
-          <w:color w:val="1E293B"/>
-          <w:rFonts w:ascii="Segoe UI" w:hAnsi="Segoe UI"/>
-        </w:rPr>
-        <w:t>10. Core User Types &amp; Scope Definition</w:t>
-      </w:r>
-      <w:r>
-        <w:rPr>
-          <w:b/>
-          <w:sz w:val="18"/>
-          <w:color w:val="059669"/>
-          <w:rFonts w:ascii="Segoe UI" w:hAnsi="Segoe UI"/>
-        </w:rPr>
-        <w:t xml:space="preserve">  [LOCKED]</w:t>
+        <w:t>10. Core User Types &amp; Institutional Onboarding Architecture  [LOCKED v1.1]</w:t>
       </w:r>
     </w:p>
     <w:tbl>
@@ -4584,16 +4578,8 @@
             </w:tcMar>
           </w:tcPr>
           <w:p>
-            <w:pPr>
-              <w:spacing w:before="0" w:after="0"/>
-            </w:pPr>
-            <w:r>
-              <w:rPr>
-                <w:sz w:val="17"/>
-                <w:color w:val="334155"/>
-                <w:rFonts w:ascii="Segoe UI" w:hAnsi="Segoe UI"/>
-              </w:rPr>
-              <w:t>Primary platform end users; restricted to own academic records and public directories.</w:t>
+            <w:r>
+              <w:t>Institutional Pre-Provisioning -&gt; Self-Activation: College imports official record. Student activates account via verified Enrollment No. + Official Email/Phone + OTP, then sets own password.</w:t>
             </w:r>
           </w:p>
         </w:tc>
@@ -4615,16 +4601,8 @@
             </w:tcMar>
           </w:tcPr>
           <w:p>
-            <w:pPr>
-              <w:spacing w:before="0" w:after="0"/>
-            </w:pPr>
-            <w:r>
-              <w:rPr>
-                <w:sz w:val="17"/>
-                <w:color w:val="334155"/>
-                <w:rFonts w:ascii="Segoe UI" w:hAnsi="Segoe UI"/>
-              </w:rPr>
-              <w:t>Personal dashboard, timetable, attendance, marks, assignments, notices, events, Campus AI, profile, project showcase, explore directory, likes.</w:t>
+            <w:r>
+              <w:t>Personal dashboard, timetable, own attendance, own marks, assignments submission, campus notices, events, Campus AI assistant, personal profile, project showcase, explore directory, project likes.</w:t>
             </w:r>
           </w:p>
         </w:tc>
@@ -4679,16 +4657,8 @@
             </w:tcMar>
           </w:tcPr>
           <w:p>
-            <w:pPr>
-              <w:spacing w:before="0" w:after="0"/>
-            </w:pPr>
-            <w:r>
-              <w:rPr>
-                <w:sz w:val="17"/>
-                <w:color w:val="334155"/>
-                <w:rFonts w:ascii="Segoe UI" w:hAnsi="Segoe UI"/>
-              </w:rPr>
-              <w:t>Academic managers; permissions strictly bounded by admin-assigned classes.</w:t>
+            <w:r>
+              <w:t>Institutional Pre-Provisioning -&gt; Self-Activation: College administration provisions faculty record. Faculty activates via Employee ID + Contact + OTP, then sets password.</w:t>
             </w:r>
           </w:p>
         </w:tc>
@@ -4710,15 +4680,7 @@
             </w:tcMar>
           </w:tcPr>
           <w:p>
-            <w:pPr>
-              <w:spacing w:before="0" w:after="0"/>
-            </w:pPr>
-            <w:r>
-              <w:rPr>
-                <w:sz w:val="17"/>
-                <w:color w:val="334155"/>
-                <w:rFonts w:ascii="Segoe UI" w:hAnsi="Segoe UI"/>
-              </w:rPr>
+            <w:r>
               <w:t>Faculty dashboard, assigned classes/subjects only, mark attendance, create/grade assignments, enter marks, post class/departmental notices.</w:t>
             </w:r>
           </w:p>
@@ -4819,11 +4781,128 @@
           </w:p>
         </w:tc>
       </w:tr>
+      <w:tr>
+        <w:tc>
+          <w:tcPr>
+            <w:tcW w:type="dxa" w:w="2200"/>
+          </w:tcPr>
+          <w:p>
+            <w:r>
+              <w:t>HOD</w:t>
+            </w:r>
+          </w:p>
+        </w:tc>
+        <w:tc>
+          <w:tcPr>
+            <w:tcW w:type="dxa" w:w="3400"/>
+          </w:tcPr>
+          <w:p>
+            <w:r>
+              <w:t>Administrative Provisioning Only: Direct appointment by executive authority with departmental scope. Authenticates via Staff Login. Never self-selectable.</w:t>
+            </w:r>
+          </w:p>
+        </w:tc>
+        <w:tc>
+          <w:tcPr>
+            <w:tcW w:type="dxa" w:w="3600"/>
+          </w:tcPr>
+          <w:p>
+            <w:r>
+              <w:t>Department-level academic oversight, review faculty class assignments, inspect departmental attendance/grades, publish department bulletins.</w:t>
+            </w:r>
+          </w:p>
+        </w:tc>
+      </w:tr>
+      <w:tr>
+        <w:tc>
+          <w:tcPr>
+            <w:tcW w:type="dxa" w:w="2200"/>
+          </w:tcPr>
+          <w:p>
+            <w:r>
+              <w:t>Principal / VP</w:t>
+            </w:r>
+          </w:p>
+        </w:tc>
+        <w:tc>
+          <w:tcPr>
+            <w:tcW w:type="dxa" w:w="3400"/>
+          </w:tcPr>
+          <w:p>
+            <w:r>
+              <w:t>Administrative Provisioning Only: Executive credentials provisioned by university governance. Authenticates via Staff Login. Never self-selectable.</w:t>
+            </w:r>
+          </w:p>
+        </w:tc>
+        <w:tc>
+          <w:tcPr>
+            <w:tcW w:type="dxa" w:w="3600"/>
+          </w:tcPr>
+          <w:p>
+            <w:r>
+              <w:t>Campus-wide institutional oversight, campus-wide bulletins, cross-department academic audits, university event authoring, executive reports.</w:t>
+            </w:r>
+          </w:p>
+        </w:tc>
+      </w:tr>
     </w:tbl>
     <w:p>
       <w:pPr>
         <w:spacing w:before="80" w:after="0"/>
       </w:pPr>
+    </w:p>
+    <w:p>
+      <w:r>
+        <w:t>10.1 Student Authentication &amp; Account Activation Flow [LOCKED]</w:t>
+        <w:br/>
+        <w:t>A student does NOT independently invent their institutional identity during signup. Before an account can be activated, the college must already have an official student record in College OS containing: Full Name, Enrollment Number / Student ID, Official College Email, Phone Number, Department / Branch, Semester, Section, Roll Number, and Academic Status.</w:t>
+        <w:br/>
+        <w:br/>
+        <w:t>Flow: College creates/imports student record -&gt; Student record exists (accountStatus = INVITED) -&gt; College informs student -&gt; Student opens College OS -&gt; Student selects 'Activate Account' -&gt; Student enters Enrollment Number + Official College Email / Verified Phone -&gt; System verifies record &amp; dispatches secure OTP -&gt; OTP verified -&gt; System displays verified student info (Read-Only) -&gt; Student creates own password (bcrypt hashed) -&gt; Account becomes ACTIVE -&gt; Student logs in -&gt; Student Dashboard.</w:t>
+        <w:br/>
+        <w:br/>
+        <w:t>Student Account Security Rule: Enrollment Number alone is strictly INSUFFICIENT for account activation. The system requires Enrollment Number + Official College Email / Verified Phone + OTP to prevent unauthorized activation.</w:t>
+        <w:br/>
+        <w:br/>
+        <w:t>Password Ownership Policy: The college does NOT provide or maintain permanent student passwords. Students create their own passwords during activation. Credentials are cryptographically hashed using bcrypt. Plaintext passwords are never stored or visible to staff.</w:t>
+        <w:br/>
+        <w:br/>
+        <w:t>10.2 Faculty &amp; Staff Authentication Flow [LOCKED]</w:t>
+        <w:br/>
+        <w:t>Faculty members follow the identical institution-controlled provisioning principle. The college administration provisions the faculty record (Employee ID, Full Name, Official Email, Department, Designation, Assigned Classes, Assigned Subjects). Faculty verifies Employee ID + Official Contact + OTP -&gt; creates password -&gt; account becomes ACTIVE -&gt; logs in via Staff Portal.</w:t>
+        <w:br/>
+        <w:br/>
+        <w:t>10.3 HOD, Principal &amp; Executive Provisioning [LOCKED]</w:t>
+        <w:br/>
+        <w:t>Zero public self-registration for institutional authorities. There is no public 'Sign Up as HOD', 'Sign Up as Principal', or 'Sign Up as VP'. These high-privilege accounts are provisioned exclusively through authorized institutional channels. A user can never elevate their own privileges through user-inputted registration fields.</w:t>
+        <w:br/>
+        <w:br/>
+        <w:t>10.4 Authentication UI Information Architecture [LOCKED]</w:t>
+        <w:br/>
+        <w:t>Public auth UX removes selectable roles. Two primary paths exist:</w:t>
+        <w:br/>
+        <w:t>1. Student Portal: Student Login &amp; Activate Student Account ('Activate Your College OS Account')</w:t>
+        <w:br/>
+        <w:t>2. Faculty &amp; College Staff Portal: Staff Login (Backend resolves role: Faculty, HOD, Principal, or VP based on database authority).</w:t>
+        <w:br/>
+        <w:br/>
+        <w:t>10.5 Account Status Lifecycle Management [LOCKED]</w:t>
+        <w:br/>
+        <w:t>• INVITED / NOT_ACTIVATED: Official record created/imported by college; pending verification and password creation.</w:t>
+        <w:br/>
+        <w:t>• ACTIVE: Successful verification + password creation; full permitted access.</w:t>
+        <w:br/>
+        <w:t>• SUSPENDED: Administrative hold; authentication blocked; tokens revoked.</w:t>
+        <w:br/>
+        <w:t>• GRADUATED / INACTIVE: Student graduated or faculty offboarded; read-only/archived.</w:t>
+        <w:br/>
+        <w:br/>
+        <w:t>10.6 Institution-Controlled Data vs. User-Controlled Profile Data [LOCKED]</w:t>
+        <w:br/>
+        <w:t>• Institution-Controlled Data (Read-Only for User): Full Name, Enrollment No. / Student ID, Roll No., Official College Email, Institutional Phone, Department, Semester, Section, Academic Status, Faculty Employee ID, Designation, Assigned Classes/Subjects, Role.</w:t>
+        <w:br/>
+        <w:t>• User-Controlled Profile Data (Customizable by User): Profile Avatar, Bio, Technical Skills, GitHub Link, Portfolio Website URL, Project Showcase items, Approved interests.</w:t>
+      </w:r>
     </w:p>
     <w:p>
       <w:pPr>
@@ -5333,15 +5412,7 @@
             </w:tcMar>
           </w:tcPr>
           <w:p>
-            <w:pPr>
-              <w:spacing w:before="0" w:after="0"/>
-            </w:pPr>
-            <w:r>
-              <w:rPr>
-                <w:sz w:val="17"/>
-                <w:color w:val="334155"/>
-                <w:rFonts w:ascii="Segoe UI" w:hAnsi="Segoe UI"/>
-              </w:rPr>
+            <w:r>
               <w:t>Authentication &amp; RBAC</w:t>
             </w:r>
           </w:p>
@@ -5364,16 +5435,8 @@
             </w:tcMar>
           </w:tcPr>
           <w:p>
-            <w:pPr>
-              <w:spacing w:before="0" w:after="0"/>
-            </w:pPr>
-            <w:r>
-              <w:rPr>
-                <w:sz w:val="17"/>
-                <w:color w:val="334155"/>
-                <w:rFonts w:ascii="Segoe UI" w:hAnsi="Segoe UI"/>
-              </w:rPr>
-              <w:t>Secure registration, login, JWT session handling, role identification, route authorization.</w:t>
+            <w:r>
+              <w:t>Institution-controlled user provisioning, student account activation (Enrollment + Contact + OTP), faculty/staff activation, role provisioning, secure credential creation, login, session lifecycle (JWT/HttpOnly), RBAC authorization, account lifecycle management, and verification.</w:t>
             </w:r>
           </w:p>
         </w:tc>
@@ -11054,6 +11117,326 @@
                 <w:rFonts w:ascii="Segoe UI" w:hAnsi="Segoe UI"/>
               </w:rPr>
               <w:t>Core First -&gt; Stabilize -&gt; Expand lifecycle execution</w:t>
+            </w:r>
+          </w:p>
+        </w:tc>
+      </w:tr>
+      <w:tr>
+        <w:tc>
+          <w:tcPr>
+            <w:tcW w:type="dxa" w:w="2400"/>
+          </w:tcPr>
+          <w:p>
+            <w:r>
+              <w:t>College-Controlled Identity</w:t>
+            </w:r>
+          </w:p>
+        </w:tc>
+        <w:tc>
+          <w:tcPr>
+            <w:tcW w:type="dxa" w:w="1600"/>
+          </w:tcPr>
+          <w:p>
+            <w:r>
+              <w:t>LOCKED v1.1</w:t>
+            </w:r>
+          </w:p>
+        </w:tc>
+        <w:tc>
+          <w:tcPr>
+            <w:tcW w:type="dxa" w:w="5200"/>
+          </w:tcPr>
+          <w:p>
+            <w:r>
+              <w:t>Users do not choose their role; the institution provisions and authorizes all student, faculty, and administrative identities.</w:t>
+            </w:r>
+          </w:p>
+        </w:tc>
+      </w:tr>
+      <w:tr>
+        <w:tc>
+          <w:tcPr>
+            <w:tcW w:type="dxa" w:w="2400"/>
+          </w:tcPr>
+          <w:p>
+            <w:r>
+              <w:t>No Open Registration</w:t>
+            </w:r>
+          </w:p>
+        </w:tc>
+        <w:tc>
+          <w:tcPr>
+            <w:tcW w:type="dxa" w:w="1600"/>
+          </w:tcPr>
+          <w:p>
+            <w:r>
+              <w:t>LOCKED v1.1</w:t>
+            </w:r>
+          </w:p>
+        </w:tc>
+        <w:tc>
+          <w:tcPr>
+            <w:tcW w:type="dxa" w:w="5200"/>
+          </w:tcPr>
+          <w:p>
+            <w:r>
+              <w:t>Public self-registration with arbitrary role selection is strictly rejected across all user levels.</w:t>
+            </w:r>
+          </w:p>
+        </w:tc>
+      </w:tr>
+      <w:tr>
+        <w:tc>
+          <w:tcPr>
+            <w:tcW w:type="dxa" w:w="2400"/>
+          </w:tcPr>
+          <w:p>
+            <w:r>
+              <w:t>Student Account Activation</w:t>
+            </w:r>
+          </w:p>
+        </w:tc>
+        <w:tc>
+          <w:tcPr>
+            <w:tcW w:type="dxa" w:w="1600"/>
+          </w:tcPr>
+          <w:p>
+            <w:r>
+              <w:t>LOCKED v1.1</w:t>
+            </w:r>
+          </w:p>
+        </w:tc>
+        <w:tc>
+          <w:tcPr>
+            <w:tcW w:type="dxa" w:w="5200"/>
+          </w:tcPr>
+          <w:p>
+            <w:r>
+              <w:t>Students activate pre-provisioned records using Enrollment Number + Official Email/Phone + OTP; official academic identity is read-only.</w:t>
+            </w:r>
+          </w:p>
+        </w:tc>
+      </w:tr>
+      <w:tr>
+        <w:tc>
+          <w:tcPr>
+            <w:tcW w:type="dxa" w:w="2400"/>
+          </w:tcPr>
+          <w:p>
+            <w:r>
+              <w:t>Multi-Factor Security Rule</w:t>
+            </w:r>
+          </w:p>
+        </w:tc>
+        <w:tc>
+          <w:tcPr>
+            <w:tcW w:type="dxa" w:w="1600"/>
+          </w:tcPr>
+          <w:p>
+            <w:r>
+              <w:t>LOCKED v1.1</w:t>
+            </w:r>
+          </w:p>
+        </w:tc>
+        <w:tc>
+          <w:tcPr>
+            <w:tcW w:type="dxa" w:w="5200"/>
+          </w:tcPr>
+          <w:p>
+            <w:r>
+              <w:t>Enrollment Number alone is insufficient for activation; verified institution-controlled contact + OTP is mandatory.</w:t>
+            </w:r>
+          </w:p>
+        </w:tc>
+      </w:tr>
+      <w:tr>
+        <w:tc>
+          <w:tcPr>
+            <w:tcW w:type="dxa" w:w="2400"/>
+          </w:tcPr>
+          <w:p>
+            <w:r>
+              <w:t>User Password Ownership</w:t>
+            </w:r>
+          </w:p>
+        </w:tc>
+        <w:tc>
+          <w:tcPr>
+            <w:tcW w:type="dxa" w:w="1600"/>
+          </w:tcPr>
+          <w:p>
+            <w:r>
+              <w:t>LOCKED v1.1</w:t>
+            </w:r>
+          </w:p>
+        </w:tc>
+        <w:tc>
+          <w:tcPr>
+            <w:tcW w:type="dxa" w:w="5200"/>
+          </w:tcPr>
+          <w:p>
+            <w:r>
+              <w:t>Users create their own passwords during activation; stored via bcrypt; college staff does not maintain or see plaintext passwords.</w:t>
+            </w:r>
+          </w:p>
+        </w:tc>
+      </w:tr>
+      <w:tr>
+        <w:tc>
+          <w:tcPr>
+            <w:tcW w:type="dxa" w:w="2400"/>
+          </w:tcPr>
+          <w:p>
+            <w:r>
+              <w:t>Faculty Account Activation</w:t>
+            </w:r>
+          </w:p>
+        </w:tc>
+        <w:tc>
+          <w:tcPr>
+            <w:tcW w:type="dxa" w:w="1600"/>
+          </w:tcPr>
+          <w:p>
+            <w:r>
+              <w:t>LOCKED v1.1</w:t>
+            </w:r>
+          </w:p>
+        </w:tc>
+        <w:tc>
+          <w:tcPr>
+            <w:tcW w:type="dxa" w:w="5200"/>
+          </w:tcPr>
+          <w:p>
+            <w:r>
+              <w:t>Faculty activate provisioned records using Employee ID + Official Contact + OTP; permissions derive from institutional course mapping.</w:t>
+            </w:r>
+          </w:p>
+        </w:tc>
+      </w:tr>
+      <w:tr>
+        <w:tc>
+          <w:tcPr>
+            <w:tcW w:type="dxa" w:w="2400"/>
+          </w:tcPr>
+          <w:p>
+            <w:r>
+              <w:t>HOD / Principal Provisioning</w:t>
+            </w:r>
+          </w:p>
+        </w:tc>
+        <w:tc>
+          <w:tcPr>
+            <w:tcW w:type="dxa" w:w="1600"/>
+          </w:tcPr>
+          <w:p>
+            <w:r>
+              <w:t>LOCKED v1.1</w:t>
+            </w:r>
+          </w:p>
+        </w:tc>
+        <w:tc>
+          <w:tcPr>
+            <w:tcW w:type="dxa" w:w="5200"/>
+          </w:tcPr>
+          <w:p>
+            <w:r>
+              <w:t>Administrative accounts are provisioned exclusively through authorized institutional channels; zero public self-elevation.</w:t>
+            </w:r>
+          </w:p>
+        </w:tc>
+      </w:tr>
+      <w:tr>
+        <w:tc>
+          <w:tcPr>
+            <w:tcW w:type="dxa" w:w="2400"/>
+          </w:tcPr>
+          <w:p>
+            <w:r>
+              <w:t>Authoritative Role Backend</w:t>
+            </w:r>
+          </w:p>
+        </w:tc>
+        <w:tc>
+          <w:tcPr>
+            <w:tcW w:type="dxa" w:w="1600"/>
+          </w:tcPr>
+          <w:p>
+            <w:r>
+              <w:t>LOCKED v1.1</w:t>
+            </w:r>
+          </w:p>
+        </w:tc>
+        <w:tc>
+          <w:tcPr>
+            <w:tcW w:type="dxa" w:w="5200"/>
+          </w:tcPr>
+          <w:p>
+            <w:r>
+              <w:t>Roles are non-selectable and enforced by backend database authority; frontend role claims are never trusted.</w:t>
+            </w:r>
+          </w:p>
+        </w:tc>
+      </w:tr>
+      <w:tr>
+        <w:tc>
+          <w:tcPr>
+            <w:tcW w:type="dxa" w:w="2400"/>
+          </w:tcPr>
+          <w:p>
+            <w:r>
+              <w:t>Identity vs. Profile Boundary</w:t>
+            </w:r>
+          </w:p>
+        </w:tc>
+        <w:tc>
+          <w:tcPr>
+            <w:tcW w:type="dxa" w:w="1600"/>
+          </w:tcPr>
+          <w:p>
+            <w:r>
+              <w:t>LOCKED v1.1</w:t>
+            </w:r>
+          </w:p>
+        </w:tc>
+        <w:tc>
+          <w:tcPr>
+            <w:tcW w:type="dxa" w:w="5200"/>
+          </w:tcPr>
+          <w:p>
+            <w:r>
+              <w:t>Institution-controlled academic fields (immutable by user) are strictly separated from user-controlled showcase portfolio fields.</w:t>
+            </w:r>
+          </w:p>
+        </w:tc>
+      </w:tr>
+      <w:tr>
+        <w:tc>
+          <w:tcPr>
+            <w:tcW w:type="dxa" w:w="2400"/>
+          </w:tcPr>
+          <w:p>
+            <w:r>
+              <w:t>Account Lifecycle Model</w:t>
+            </w:r>
+          </w:p>
+        </w:tc>
+        <w:tc>
+          <w:tcPr>
+            <w:tcW w:type="dxa" w:w="1600"/>
+          </w:tcPr>
+          <w:p>
+            <w:r>
+              <w:t>LOCKED v1.1</w:t>
+            </w:r>
+          </w:p>
+        </w:tc>
+        <w:tc>
+          <w:tcPr>
+            <w:tcW w:type="dxa" w:w="5200"/>
+          </w:tcPr>
+          <w:p>
+            <w:r>
+              <w:t>Formal lifecycle states enforced: INVITED/NOT_ACTIVATED -&gt; ACTIVE -&gt; SUSPENDED -&gt; GRADUATED/INACTIVE.</w:t>
             </w:r>
           </w:p>
         </w:tc>
@@ -17233,16 +17616,8 @@
             </w:tcMar>
           </w:tcPr>
           <w:p>
-            <w:pPr>
-              <w:spacing w:before="0" w:after="0"/>
-            </w:pPr>
-            <w:r>
-              <w:rPr>
-                <w:sz w:val="17"/>
-                <w:color w:val="334155"/>
-                <w:rFonts w:ascii="Segoe UI" w:hAnsi="Segoe UI"/>
-              </w:rPr>
-              <w:t>Login, Profile Password Update</w:t>
+            <w:r>
+              <w:t>Activate Account (Enrollment + Contact + OTP), Login, Self-service Password Change</w:t>
             </w:r>
           </w:p>
         </w:tc>
@@ -17264,16 +17639,8 @@
             </w:tcMar>
           </w:tcPr>
           <w:p>
-            <w:pPr>
-              <w:spacing w:before="0" w:after="0"/>
-            </w:pPr>
-            <w:r>
-              <w:rPr>
-                <w:sz w:val="17"/>
-                <w:color w:val="334155"/>
-                <w:rFonts w:ascii="Segoe UI" w:hAnsi="Segoe UI"/>
-              </w:rPr>
-              <w:t>Login, Profile Password Update</w:t>
+            <w:r>
+              <w:t>Activate Account (Employee ID + Contact + OTP), Login, Self-service Password Change</w:t>
             </w:r>
           </w:p>
         </w:tc>
@@ -17295,16 +17662,8 @@
             </w:tcMar>
           </w:tcPr>
           <w:p>
-            <w:pPr>
-              <w:spacing w:before="0" w:after="0"/>
-            </w:pPr>
-            <w:r>
-              <w:rPr>
-                <w:sz w:val="17"/>
-                <w:color w:val="334155"/>
-                <w:rFonts w:ascii="Segoe UI" w:hAnsi="Segoe UI"/>
-              </w:rPr>
-              <w:t>Create Users, Revoke Access, Assign Roles</w:t>
+            <w:r>
+              <w:t>Provision Users (Import/Create Student &amp; Staff records), Assign Roles, Revoke Access, Audit Lifecycle State</w:t>
             </w:r>
           </w:p>
         </w:tc>
@@ -17359,16 +17718,8 @@
             </w:tcMar>
           </w:tcPr>
           <w:p>
-            <w:pPr>
-              <w:spacing w:before="0" w:after="0"/>
-            </w:pPr>
-            <w:r>
-              <w:rPr>
-                <w:sz w:val="17"/>
-                <w:color w:val="334155"/>
-                <w:rFonts w:ascii="Segoe UI" w:hAnsi="Segoe UI"/>
-              </w:rPr>
-              <w:t>Create, Read All, Update Own</w:t>
+            <w:r>
+              <w:t>Read All Directory, Update Student-Controlled Fields (Bio, Skills, GitHub, Portfolio). Zero edit access to Institution-Controlled Identity.</w:t>
             </w:r>
           </w:p>
         </w:tc>
@@ -17390,16 +17741,8 @@
             </w:tcMar>
           </w:tcPr>
           <w:p>
-            <w:pPr>
-              <w:spacing w:before="0" w:after="0"/>
-            </w:pPr>
-            <w:r>
-              <w:rPr>
-                <w:sz w:val="17"/>
-                <w:color w:val="334155"/>
-                <w:rFonts w:ascii="Segoe UI" w:hAnsi="Segoe UI"/>
-              </w:rPr>
-              <w:t>Read All Students in Assigned Classes</w:t>
+            <w:r>
+              <w:t>Read All Students in Assigned Classes/Subjects</w:t>
             </w:r>
           </w:p>
         </w:tc>
@@ -17421,16 +17764,8 @@
             </w:tcMar>
           </w:tcPr>
           <w:p>
-            <w:pPr>
-              <w:spacing w:before="0" w:after="0"/>
-            </w:pPr>
-            <w:r>
-              <w:rPr>
-                <w:sz w:val="17"/>
-                <w:color w:val="334155"/>
-                <w:rFonts w:ascii="Segoe UI" w:hAnsi="Segoe UI"/>
-              </w:rPr>
-              <w:t>Read All, Administrative Edit / Suspend</w:t>
+            <w:r>
+              <w:t>Read All, Administrative Provisioning, Official Data Updates, Suspend Accounts</w:t>
             </w:r>
           </w:p>
         </w:tc>
@@ -18633,17 +18968,10 @@
             </w:tcMar>
           </w:tcPr>
           <w:p>
-            <w:pPr>
-              <w:spacing w:before="0" w:after="0"/>
-            </w:pPr>
-            <w:r>
-              <w:rPr>
-                <w:sz w:val="17"/>
-                <w:color w:val="334155"/>
-                <w:rFonts w:ascii="Segoe UI" w:hAnsi="Segoe UI"/>
-              </w:rPr>
-              <w:t>🟢 BASELINE LOCKED
-Source of Truth v1.0</w:t>
+            <w:r>
+              <w:t>🟢 BASELINE UPDATED &amp; LOCKED</w:t>
+              <w:br/>
+              <w:t>Source of Truth v1.1</w:t>
             </w:r>
           </w:p>
         </w:tc>

</xml_diff>